<commit_message>
Update website details document
</commit_message>
<xml_diff>
--- a/Website details.docx
+++ b/Website details.docx
@@ -1197,7 +1197,8 @@
       </w:r>
       <w:r>
         <w:rPr>
-          <w:rFonts w:ascii="Arial" w:hAnsi="Arial" w:cs="Arial"/>
+          <w:rStyle w:val="HTMLCode"/>
+          <w:rFonts w:ascii="Menlo" w:eastAsiaTheme="minorHAnsi" w:hAnsi="Menlo" w:cs="Menlo"/>
           <w:color w:val="000000" w:themeColor="text1"/>
           <w:sz w:val="21"/>
           <w:szCs w:val="21"/>
@@ -1207,7 +1208,8 @@
       </w:r>
       <w:r>
         <w:rPr>
-          <w:rFonts w:ascii="Arial" w:hAnsi="Arial" w:cs="Arial"/>
+          <w:rStyle w:val="HTMLCode"/>
+          <w:rFonts w:ascii="Menlo" w:eastAsiaTheme="minorHAnsi" w:hAnsi="Menlo" w:cs="Menlo"/>
           <w:color w:val="000000" w:themeColor="text1"/>
           <w:sz w:val="21"/>
           <w:szCs w:val="21"/>
@@ -1217,6 +1219,17 @@
       </w:r>
       <w:r>
         <w:rPr>
+          <w:rStyle w:val="HTMLCode"/>
+          <w:rFonts w:ascii="Menlo" w:eastAsiaTheme="minorHAnsi" w:hAnsi="Menlo" w:cs="Menlo"/>
+          <w:color w:val="000000" w:themeColor="text1"/>
+          <w:sz w:val="21"/>
+          <w:szCs w:val="21"/>
+          <w:shd w:val="clear" w:color="auto" w:fill="FFFFFF"/>
+        </w:rPr>
+        <w:instrText>partnerships@initiative4legalaid.org</w:instrText>
+      </w:r>
+      <w:r>
+        <w:rPr>
           <w:rFonts w:ascii="Arial" w:hAnsi="Arial" w:cs="Arial"/>
           <w:color w:val="000000" w:themeColor="text1"/>
           <w:sz w:val="21"/>
@@ -1227,25 +1240,8 @@
       </w:r>
       <w:r>
         <w:rPr>
-          <w:rFonts w:ascii="Arial" w:hAnsi="Arial" w:cs="Arial"/>
-          <w:color w:val="000000" w:themeColor="text1"/>
-          <w:sz w:val="21"/>
-          <w:szCs w:val="21"/>
-          <w:shd w:val="clear" w:color="auto" w:fill="FFFFFF"/>
-        </w:rPr>
-        <w:instrText>partnerships</w:instrText>
-      </w:r>
-      <w:r>
-        <w:rPr>
-          <w:rFonts w:ascii="Raleway" w:eastAsia="Times New Roman" w:hAnsi="Raleway" w:cs="Arial"/>
-          <w:kern w:val="36"/>
-          <w14:ligatures w14:val="none"/>
-        </w:rPr>
-        <w:instrText>@initiative4legalaid.org</w:instrText>
-      </w:r>
-      <w:r>
-        <w:rPr>
-          <w:rFonts w:ascii="Arial" w:hAnsi="Arial" w:cs="Arial"/>
+          <w:rStyle w:val="HTMLCode"/>
+          <w:rFonts w:ascii="Menlo" w:eastAsiaTheme="minorHAnsi" w:hAnsi="Menlo" w:cs="Menlo"/>
           <w:color w:val="000000" w:themeColor="text1"/>
           <w:sz w:val="21"/>
           <w:szCs w:val="21"/>
@@ -1255,7 +1251,8 @@
       </w:r>
       <w:r>
         <w:rPr>
-          <w:rFonts w:ascii="Arial" w:hAnsi="Arial" w:cs="Arial"/>
+          <w:rStyle w:val="HTMLCode"/>
+          <w:rFonts w:ascii="Menlo" w:eastAsiaTheme="minorHAnsi" w:hAnsi="Menlo" w:cs="Menlo"/>
           <w:color w:val="000000" w:themeColor="text1"/>
           <w:sz w:val="21"/>
           <w:szCs w:val="21"/>
@@ -1266,6 +1263,26 @@
       <w:r>
         <w:rPr>
           <w:rStyle w:val="Hyperlink"/>
+          <w:rFonts w:ascii="Menlo" w:hAnsi="Menlo" w:cs="Menlo"/>
+          <w:sz w:val="21"/>
+          <w:szCs w:val="21"/>
+          <w:shd w:val="clear" w:color="auto" w:fill="FFFFFF"/>
+        </w:rPr>
+        <w:t>p</w:t>
+      </w:r>
+      <w:r>
+        <w:rPr>
+          <w:rStyle w:val="Hyperlink"/>
+          <w:rFonts w:ascii="Menlo" w:hAnsi="Menlo" w:cs="Menlo"/>
+          <w:sz w:val="21"/>
+          <w:szCs w:val="21"/>
+          <w:shd w:val="clear" w:color="auto" w:fill="FFFFFF"/>
+        </w:rPr>
+        <w:t>artnerships@initiative4legalaid.org</w:t>
+      </w:r>
+      <w:r>
+        <w:rPr>
+          <w:rStyle w:val="Hyperlink"/>
           <w:rFonts w:ascii="Arial" w:hAnsi="Arial" w:cs="Arial"/>
           <w:sz w:val="21"/>
           <w:szCs w:val="21"/>
@@ -1275,35 +1292,8 @@
       </w:r>
       <w:r>
         <w:rPr>
-          <w:rStyle w:val="Hyperlink"/>
-          <w:rFonts w:ascii="Arial" w:hAnsi="Arial" w:cs="Arial"/>
-          <w:sz w:val="21"/>
-          <w:szCs w:val="21"/>
-          <w:shd w:val="clear" w:color="auto" w:fill="FFFFFF"/>
-        </w:rPr>
-        <w:t>partnerships</w:t>
-      </w:r>
-      <w:r>
-        <w:rPr>
-          <w:rStyle w:val="Hyperlink"/>
-          <w:rFonts w:ascii="Raleway" w:eastAsia="Times New Roman" w:hAnsi="Raleway" w:cs="Arial"/>
-          <w:kern w:val="36"/>
-          <w14:ligatures w14:val="none"/>
-        </w:rPr>
-        <w:t>@</w:t>
-      </w:r>
-      <w:r>
-        <w:rPr>
-          <w:rStyle w:val="Hyperlink"/>
-          <w:rFonts w:ascii="Raleway" w:eastAsia="Times New Roman" w:hAnsi="Raleway" w:cs="Arial"/>
-          <w:kern w:val="36"/>
-          <w14:ligatures w14:val="none"/>
-        </w:rPr>
-        <w:t>initiative4legalaid.org</w:t>
-      </w:r>
-      <w:r>
-        <w:rPr>
-          <w:rFonts w:ascii="Arial" w:hAnsi="Arial" w:cs="Arial"/>
+          <w:rStyle w:val="HTMLCode"/>
+          <w:rFonts w:ascii="Menlo" w:eastAsiaTheme="minorHAnsi" w:hAnsi="Menlo" w:cs="Menlo"/>
           <w:color w:val="000000" w:themeColor="text1"/>
           <w:sz w:val="21"/>
           <w:szCs w:val="21"/>
@@ -1338,45 +1328,15 @@
       </w:r>
       <w:r>
         <w:rPr>
-          <w:rFonts w:ascii="Raleway" w:eastAsia="Times New Roman" w:hAnsi="Raleway" w:cs="Arial"/>
-          <w:color w:val="005588"/>
-          <w:kern w:val="36"/>
-          <w14:ligatures w14:val="none"/>
+          <w:rStyle w:val="HTMLCode"/>
+          <w:rFonts w:ascii="Menlo" w:eastAsiaTheme="minorHAnsi" w:hAnsi="Menlo" w:cs="Menlo"/>
+          <w:color w:val="000000" w:themeColor="text1"/>
+          <w:sz w:val="21"/>
+          <w:szCs w:val="21"/>
+          <w:shd w:val="clear" w:color="auto" w:fill="FFFFFF"/>
         </w:rPr>
         <w:t>Admin123</w:t>
       </w:r>
-    </w:p>
-    <w:p>
-      <w:pPr>
-        <w:pBdr>
-          <w:bottom w:val="single" w:sz="6" w:space="5" w:color="CCCCCC"/>
-        </w:pBdr>
-        <w:shd w:val="clear" w:color="auto" w:fill="FFFFFF"/>
-        <w:spacing w:after="225" w:line="240" w:lineRule="auto"/>
-        <w:outlineLvl w:val="0"/>
-        <w:rPr>
-          <w:rFonts w:ascii="Raleway" w:eastAsia="Times New Roman" w:hAnsi="Raleway" w:cs="Arial"/>
-          <w:color w:val="005588"/>
-          <w:kern w:val="36"/>
-          <w14:ligatures w14:val="none"/>
-        </w:rPr>
-      </w:pPr>
-    </w:p>
-    <w:p>
-      <w:pPr>
-        <w:pBdr>
-          <w:bottom w:val="single" w:sz="6" w:space="5" w:color="CCCCCC"/>
-        </w:pBdr>
-        <w:shd w:val="clear" w:color="auto" w:fill="FFFFFF"/>
-        <w:spacing w:after="225" w:line="240" w:lineRule="auto"/>
-        <w:outlineLvl w:val="0"/>
-        <w:rPr>
-          <w:rFonts w:ascii="Raleway" w:eastAsia="Times New Roman" w:hAnsi="Raleway" w:cs="Arial"/>
-          <w:color w:val="005588"/>
-          <w:kern w:val="36"/>
-          <w14:ligatures w14:val="none"/>
-        </w:rPr>
-      </w:pPr>
     </w:p>
     <w:p>
       <w:pPr>
@@ -3125,6 +3085,7 @@
           <w:szCs w:val="21"/>
           <w:shd w:val="clear" w:color="auto" w:fill="FFFFFF"/>
         </w:rPr>
+        <w:lastRenderedPageBreak/>
         <w:t>victoria</w:t>
       </w:r>
       <w:proofErr w:type="spellEnd"/>
@@ -5297,7 +5258,6 @@
           <w:kern w:val="0"/>
           <w14:ligatures w14:val="none"/>
         </w:rPr>
-        <w:lastRenderedPageBreak/>
         <w:br/>
         <w:t>10:42 AM</w:t>
       </w:r>
@@ -5320,6 +5280,7 @@
           <w:kern w:val="0"/>
           <w14:ligatures w14:val="none"/>
         </w:rPr>
+        <w:lastRenderedPageBreak/>
         <w:t>OK, good. SSH is now enabled for your account.</w:t>
       </w:r>
       <w:r>
@@ -6506,6 +6467,19 @@
       <w:bCs/>
     </w:rPr>
   </w:style>
+  <w:style w:type="character" w:styleId="HTMLCode">
+    <w:name w:val="HTML Code"/>
+    <w:basedOn w:val="DefaultParagraphFont"/>
+    <w:uiPriority w:val="99"/>
+    <w:semiHidden/>
+    <w:unhideWhenUsed/>
+    <w:rsid w:val="00E73BDD"/>
+    <w:rPr>
+      <w:rFonts w:ascii="Courier New" w:eastAsia="Times New Roman" w:hAnsi="Courier New" w:cs="Courier New"/>
+      <w:sz w:val="20"/>
+      <w:szCs w:val="20"/>
+    </w:rPr>
+  </w:style>
 </w:styles>
 </file>
 

</xml_diff>